<commit_message>
Add final project report and update experimental plan figures
</commit_message>
<xml_diff>
--- a/VoiceGuard_Experimental_Plan.docx
+++ b/VoiceGuard_Experimental_Plan.docx
@@ -2104,7 +2104,7 @@
               <w:pStyle w:val="Compact"/>
             </w:pPr>
             <w:r>
-              <w:t xml:space="preserve">98.0%</w:t>
+              <w:t xml:space="preserve">100%</w:t>
             </w:r>
           </w:p>
         </w:tc>
@@ -2126,7 +2126,7 @@
               <w:pStyle w:val="Compact"/>
             </w:pPr>
             <w:r>
-              <w:t xml:space="preserve">37.5%</w:t>
+              <w:t xml:space="preserve">37.9%</w:t>
             </w:r>
           </w:p>
         </w:tc>

</xml_diff>